<commit_message>
Add Falk Strom DS5 reference script; update thermal simulation guide
</commit_message>
<xml_diff>
--- a/fMRI_triangular_wave/thermal/docs/thermal_simulation_guide.docx
+++ b/fMRI_triangular_wave/thermal/docs/thermal_simulation_guide.docx
@@ -670,6 +670,16 @@
     </w:p>
     <w:p>
       <w:r>
+        <w:t>Bragi: Linux</w:t>
+      </w:r>
+    </w:p>
+    <w:p>
+      <w:r>
+        <w:t xml:space="preserve">Reboot from disk, choose DEVIAN/LINUX </w:t>
+      </w:r>
+    </w:p>
+    <w:p>
+      <w:r>
         <w:t>Open a terminal</w:t>
       </w:r>
     </w:p>
@@ -686,7 +696,13 @@
         <w:t xml:space="preserve"> environment by typing: PSYCHOPY</w:t>
       </w:r>
       <w:r>
-        <w:t xml:space="preserve"> (and then typing spyder)</w:t>
+        <w:t xml:space="preserve"> (and then typing spyder</w:t>
+      </w:r>
+      <w:r>
+        <w:t xml:space="preserve"> if you want to debug in spyder</w:t>
+      </w:r>
+      <w:r>
+        <w:t>)</w:t>
       </w:r>
     </w:p>
     <w:p>
@@ -695,13 +711,357 @@
       </w:r>
     </w:p>
     <w:p>
+      <w:pPr>
+        <w:spacing w:after="0"/>
+      </w:pPr>
       <w:r>
+        <w:lastRenderedPageBreak/>
         <w:br/>
         <w:t>Use the commands above to run the experiment</w:t>
       </w:r>
       <w:r>
         <w:t xml:space="preserve"> directly from the terminal (or within spyder)</w:t>
       </w:r>
+    </w:p>
+    <w:p>
+      <w:pPr>
+        <w:spacing w:after="0"/>
+      </w:pPr>
+      <w:r>
+        <w:t xml:space="preserve">  Pre-baseline:       </w:t>
+      </w:r>
+      <w:r>
+        <w:tab/>
+      </w:r>
+      <w:r>
+        <w:t xml:space="preserve">6s                                    </w:t>
+      </w:r>
+    </w:p>
+    <w:p>
+      <w:pPr>
+        <w:spacing w:after="0"/>
+      </w:pPr>
+      <w:r>
+        <w:t xml:space="preserve">  Half 1:            </w:t>
+      </w:r>
+      <w:r>
+        <w:tab/>
+      </w:r>
+      <w:r>
+        <w:tab/>
+      </w:r>
+      <w:r>
+        <w:t xml:space="preserve">12 × 28s = 336s                                                            </w:t>
+      </w:r>
+    </w:p>
+    <w:p>
+      <w:pPr>
+        <w:spacing w:after="0"/>
+      </w:pPr>
+      <w:r>
+        <w:t xml:space="preserve">  Mid-run pause:     </w:t>
+      </w:r>
+      <w:r>
+        <w:tab/>
+      </w:r>
+      <w:r>
+        <w:t xml:space="preserve">30s          ← no extra 6s on either side                                  </w:t>
+      </w:r>
+    </w:p>
+    <w:p>
+      <w:pPr>
+        <w:spacing w:after="0"/>
+      </w:pPr>
+      <w:r>
+        <w:t xml:space="preserve">  Half 2:            </w:t>
+      </w:r>
+      <w:r>
+        <w:tab/>
+      </w:r>
+      <w:r>
+        <w:tab/>
+      </w:r>
+      <w:r>
+        <w:t xml:space="preserve">12 × 28s = 336s                                                            </w:t>
+      </w:r>
+    </w:p>
+    <w:p>
+      <w:pPr>
+        <w:spacing w:after="0"/>
+      </w:pPr>
+      <w:r>
+        <w:t xml:space="preserve">  Post-baseline:      </w:t>
+      </w:r>
+      <w:r>
+        <w:tab/>
+      </w:r>
+      <w:r>
+        <w:t xml:space="preserve">6s                                                                        </w:t>
+      </w:r>
+    </w:p>
+    <w:p>
+      <w:pPr>
+        <w:spacing w:after="0"/>
+      </w:pPr>
+      <w:r>
+        <w:t xml:space="preserve">  ─────────────────────────────                                                                 </w:t>
+      </w:r>
+    </w:p>
+    <w:p>
+      <w:pPr>
+        <w:spacing w:after="0"/>
+      </w:pPr>
+      <w:r>
+        <w:t xml:space="preserve">  Total:             714s = 11 min 54s = 476 volumes   </w:t>
+      </w:r>
+    </w:p>
+    <w:p>
+      <w:pPr>
+        <w:spacing w:after="0"/>
+      </w:pPr>
+    </w:p>
+    <w:p>
+      <w:pPr>
+        <w:spacing w:after="0"/>
+        <w:rPr>
+          <w:b/>
+          <w:bCs/>
+        </w:rPr>
+      </w:pPr>
+      <w:r>
+        <w:sym w:font="Wingdings" w:char="F0E0"/>
+      </w:r>
+      <w:r>
+        <w:t xml:space="preserve"> </w:t>
+      </w:r>
+      <w:r>
+        <w:rPr>
+          <w:b/>
+          <w:bCs/>
+        </w:rPr>
+        <w:t>500 volumes</w:t>
+      </w:r>
+      <w:r>
+        <w:rPr>
+          <w:b/>
+          <w:bCs/>
+        </w:rPr>
+        <w:t xml:space="preserve"> (safety margin)</w:t>
+      </w:r>
+    </w:p>
+    <w:p>
+      <w:pPr>
+        <w:spacing w:after="0"/>
+        <w:rPr>
+          <w:b/>
+          <w:bCs/>
+        </w:rPr>
+      </w:pPr>
+    </w:p>
+    <w:p>
+      <w:pPr>
+        <w:spacing w:after="0"/>
+        <w:rPr>
+          <w:b/>
+          <w:bCs/>
+        </w:rPr>
+      </w:pPr>
+      <w:r>
+        <w:rPr>
+          <w:b/>
+          <w:bCs/>
+        </w:rPr>
+        <w:t>L01_260617</w:t>
+      </w:r>
+    </w:p>
+    <w:p>
+      <w:pPr>
+        <w:spacing w:after="0"/>
+      </w:pPr>
+      <w:r>
+        <w:t>Participant: 01 (LMP)</w:t>
+      </w:r>
+    </w:p>
+    <w:p>
+      <w:pPr>
+        <w:spacing w:after="0"/>
+      </w:pPr>
+      <w:r>
+        <w:t>Body location:</w:t>
+      </w:r>
+      <w:r>
+        <w:t xml:space="preserve"> left</w:t>
+      </w:r>
+      <w:r>
+        <w:t xml:space="preserve"> arm</w:t>
+      </w:r>
+    </w:p>
+    <w:p>
+      <w:pPr>
+        <w:spacing w:after="0"/>
+      </w:pPr>
+      <w:r>
+        <w:t xml:space="preserve">Start Time </w:t>
+      </w:r>
+    </w:p>
+    <w:p>
+      <w:pPr>
+        <w:spacing w:after="0"/>
+        <w:ind w:firstLine="720"/>
+      </w:pPr>
+      <w:r>
+        <w:t xml:space="preserve">Run 1: </w:t>
+      </w:r>
+      <w:r>
+        <w:t>~14:0</w:t>
+      </w:r>
+      <w:r>
+        <w:t>7</w:t>
+      </w:r>
+    </w:p>
+    <w:p>
+      <w:pPr>
+        <w:spacing w:after="0"/>
+        <w:ind w:firstLine="720"/>
+      </w:pPr>
+      <w:r>
+        <w:t>Run 2: ~14:25</w:t>
+      </w:r>
+    </w:p>
+    <w:p>
+      <w:pPr>
+        <w:spacing w:after="0"/>
+      </w:pPr>
+      <w:r>
+        <w:t>Rate of temperature change</w:t>
+      </w:r>
+    </w:p>
+    <w:p>
+      <w:pPr>
+        <w:spacing w:after="0"/>
+      </w:pPr>
+      <w:r>
+        <w:tab/>
+        <w:t>2.5</w:t>
+      </w:r>
+    </w:p>
+    <w:p>
+      <w:pPr>
+        <w:spacing w:after="0"/>
+      </w:pPr>
+      <w:r>
+        <w:t>TR: 1.5 s</w:t>
+      </w:r>
+    </w:p>
+    <w:p>
+      <w:pPr>
+        <w:spacing w:after="0"/>
+      </w:pPr>
+    </w:p>
+    <w:p>
+      <w:pPr>
+        <w:spacing w:after="0"/>
+      </w:pPr>
+      <w:r>
+        <w:t>Participant: 01 (</w:t>
+      </w:r>
+      <w:r>
+        <w:t>FE</w:t>
+      </w:r>
+      <w:r>
+        <w:t>)</w:t>
+      </w:r>
+    </w:p>
+    <w:p>
+      <w:pPr>
+        <w:spacing w:after="0"/>
+      </w:pPr>
+      <w:r>
+        <w:t>Body location:</w:t>
+      </w:r>
+      <w:r>
+        <w:t xml:space="preserve"> left</w:t>
+      </w:r>
+      <w:r>
+        <w:t xml:space="preserve"> arm</w:t>
+      </w:r>
+    </w:p>
+    <w:p>
+      <w:pPr>
+        <w:spacing w:after="0"/>
+      </w:pPr>
+      <w:r>
+        <w:t xml:space="preserve">Start Time </w:t>
+      </w:r>
+    </w:p>
+    <w:p>
+      <w:pPr>
+        <w:spacing w:after="0"/>
+        <w:ind w:firstLine="720"/>
+      </w:pPr>
+      <w:r>
+        <w:t xml:space="preserve">Run 1: </w:t>
+      </w:r>
+      <w:r>
+        <w:t>~14:0</w:t>
+      </w:r>
+      <w:r>
+        <w:t>7</w:t>
+      </w:r>
+    </w:p>
+    <w:p>
+      <w:pPr>
+        <w:spacing w:after="0"/>
+        <w:ind w:firstLine="720"/>
+      </w:pPr>
+      <w:r>
+        <w:t>Run 2: ~14:25</w:t>
+      </w:r>
+    </w:p>
+    <w:p>
+      <w:pPr>
+        <w:spacing w:after="0"/>
+      </w:pPr>
+      <w:r>
+        <w:t>Rate of temperature change</w:t>
+      </w:r>
+    </w:p>
+    <w:p>
+      <w:pPr>
+        <w:spacing w:after="0"/>
+      </w:pPr>
+      <w:r>
+        <w:tab/>
+        <w:t>2.5</w:t>
+      </w:r>
+    </w:p>
+    <w:p>
+      <w:pPr>
+        <w:spacing w:after="0"/>
+      </w:pPr>
+      <w:r>
+        <w:t>TR: 1.5 s</w:t>
+      </w:r>
+    </w:p>
+    <w:p>
+      <w:pPr>
+        <w:spacing w:after="0"/>
+      </w:pPr>
+    </w:p>
+    <w:p>
+      <w:pPr>
+        <w:spacing w:after="0"/>
+      </w:pPr>
+    </w:p>
+    <w:p>
+      <w:pPr>
+        <w:spacing w:after="0"/>
+      </w:pPr>
+    </w:p>
+    <w:p>
+      <w:pPr>
+        <w:spacing w:after="0"/>
+      </w:pPr>
     </w:p>
     <w:sectPr>
       <w:pgSz w:w="12240" w:h="15840"/>

</xml_diff>